<commit_message>
docker complete prepare v1.0
</commit_message>
<xml_diff>
--- a/document-service/internal/documents/DO-FIZ-3.docx
+++ b/document-service/internal/documents/DO-FIZ-3.docx
@@ -1179,25 +1179,7 @@
           <w:sz w:val="20"/>
           <w:szCs w:val="20"/>
         </w:rPr>
-        <w:t>именуемый(</w:t>
-      </w:r>
-      <w:proofErr w:type="spellStart"/>
-      <w:r>
-        <w:rPr>
-          <w:rFonts w:ascii="Montserrat" w:eastAsia="Montserrat" w:hAnsi="Montserrat" w:cs="Montserrat"/>
-          <w:sz w:val="20"/>
-          <w:szCs w:val="20"/>
-        </w:rPr>
-        <w:t>ая</w:t>
-      </w:r>
-      <w:proofErr w:type="spellEnd"/>
-      <w:r>
-        <w:rPr>
-          <w:rFonts w:ascii="Montserrat" w:eastAsia="Montserrat" w:hAnsi="Montserrat" w:cs="Montserrat"/>
-          <w:sz w:val="20"/>
-          <w:szCs w:val="20"/>
-        </w:rPr>
-        <w:t>)</w:t>
+        <w:t>именуемый(ая)</w:t>
       </w:r>
       <w:r>
         <w:rPr>
@@ -1395,25 +1377,7 @@
           <w:sz w:val="20"/>
           <w:szCs w:val="20"/>
         </w:rPr>
-        <w:t>именуемый(</w:t>
-      </w:r>
-      <w:proofErr w:type="spellStart"/>
-      <w:r>
-        <w:rPr>
-          <w:rFonts w:ascii="Montserrat" w:eastAsia="Montserrat" w:hAnsi="Montserrat" w:cs="Montserrat"/>
-          <w:sz w:val="20"/>
-          <w:szCs w:val="20"/>
-        </w:rPr>
-        <w:t>ая</w:t>
-      </w:r>
-      <w:proofErr w:type="spellEnd"/>
-      <w:r>
-        <w:rPr>
-          <w:rFonts w:ascii="Montserrat" w:eastAsia="Montserrat" w:hAnsi="Montserrat" w:cs="Montserrat"/>
-          <w:sz w:val="20"/>
-          <w:szCs w:val="20"/>
-        </w:rPr>
-        <w:t>)</w:t>
+        <w:t>именуемый(ая)</w:t>
       </w:r>
       <w:r>
         <w:rPr>
@@ -1973,7 +1937,6 @@
         </w:rPr>
         <w:t>час</w:t>
       </w:r>
-      <w:proofErr w:type="spellStart"/>
       <w:r>
         <w:rPr>
           <w:rFonts w:ascii="Montserrat" w:eastAsia="Montserrat" w:hAnsi="Montserrat" w:cs="Montserrat"/>
@@ -1983,7 +1946,6 @@
         </w:rPr>
         <w:t>ов</w:t>
       </w:r>
-      <w:proofErr w:type="spellEnd"/>
       <w:r>
         <w:rPr>
           <w:rFonts w:ascii="Montserrat" w:eastAsia="Montserrat" w:hAnsi="Montserrat" w:cs="Montserrat"/>
@@ -2169,16 +2131,6 @@
           <w:lang w:val="en-US"/>
         </w:rPr>
         <w:t>SIN</w:t>
-      </w:r>
-      <w:r>
-        <w:rPr>
-          <w:rFonts w:ascii="Montserrat" w:eastAsia="Montserrat" w:hAnsi="Montserrat" w:cs="Montserrat"/>
-          <w:bCs/>
-          <w:sz w:val="20"/>
-          <w:szCs w:val="20"/>
-          <w:lang w:val="en-US"/>
-        </w:rPr>
-        <w:t>CE</w:t>
       </w:r>
       <w:r>
         <w:rPr>
@@ -2817,7 +2769,7 @@
           <w:i/>
           <w:sz w:val="20"/>
           <w:szCs w:val="20"/>
-          <w:lang w:val="en-US"/>
+          <w:lang w:val="ru-RU"/>
         </w:rPr>
       </w:pPr>
       <w:bookmarkStart w:id="0" w:name="_heading=h.eilct6s1smaw" w:colFirst="0" w:colLast="0"/>
@@ -5491,18 +5443,18 @@
           <w:rFonts w:ascii="Montserrat" w:eastAsia="Montserrat" w:hAnsi="Montserrat" w:cs="Montserrat"/>
           <w:sz w:val="20"/>
           <w:szCs w:val="20"/>
+          <w:lang w:val="ru-RU"/>
+        </w:rPr>
+        <w:t xml:space="preserve"> </w:t>
+      </w:r>
+      <w:r>
+        <w:rPr>
+          <w:rFonts w:ascii="Montserrat" w:eastAsia="Montserrat" w:hAnsi="Montserrat" w:cs="Montserrat"/>
+          <w:bCs/>
+          <w:sz w:val="20"/>
+          <w:szCs w:val="20"/>
           <w:lang w:val="en-US"/>
         </w:rPr>
-        <w:t xml:space="preserve"> </w:t>
-      </w:r>
-      <w:r>
-        <w:rPr>
-          <w:rFonts w:ascii="Montserrat" w:eastAsia="Montserrat" w:hAnsi="Montserrat" w:cs="Montserrat"/>
-          <w:bCs/>
-          <w:sz w:val="20"/>
-          <w:szCs w:val="20"/>
-          <w:lang w:val="en-US"/>
-        </w:rPr>
         <w:t>PRICE</w:t>
       </w:r>
       <w:r>
@@ -5575,25 +5527,7 @@
           <w:sz w:val="20"/>
           <w:szCs w:val="20"/>
         </w:rPr>
-        <w:t>(</w:t>
-      </w:r>
-      <w:proofErr w:type="spellStart"/>
-      <w:r>
-        <w:rPr>
-          <w:rFonts w:ascii="Montserrat" w:eastAsia="Montserrat" w:hAnsi="Montserrat" w:cs="Montserrat"/>
-          <w:sz w:val="20"/>
-          <w:szCs w:val="20"/>
-        </w:rPr>
-        <w:t>пп</w:t>
-      </w:r>
-      <w:proofErr w:type="spellEnd"/>
-      <w:r>
-        <w:rPr>
-          <w:rFonts w:ascii="Montserrat" w:eastAsia="Montserrat" w:hAnsi="Montserrat" w:cs="Montserrat"/>
-          <w:sz w:val="20"/>
-          <w:szCs w:val="20"/>
-        </w:rPr>
-        <w:t>.</w:t>
+        <w:t>(пп.</w:t>
       </w:r>
       <w:r>
         <w:rPr>
@@ -5717,7 +5651,7 @@
           <w:iCs/>
           <w:sz w:val="20"/>
           <w:szCs w:val="20"/>
-          <w:lang w:val="en-US"/>
+          <w:lang w:val="ru-RU"/>
         </w:rPr>
       </w:pPr>
       <w:r>
@@ -5743,7 +5677,7 @@
           <w:i/>
           <w:sz w:val="20"/>
           <w:szCs w:val="20"/>
-          <w:lang w:val="en-US"/>
+          <w:lang w:val="ru-RU"/>
         </w:rPr>
         <w:t xml:space="preserve"> </w:t>
       </w:r>
@@ -11988,7 +11922,7 @@
             <w:pPr>
               <w:spacing w:after="0" w:line="276" w:lineRule="auto"/>
               <w:rPr>
-                <w:lang w:val="en-US"/>
+                <w:lang w:val="ru-RU"/>
               </w:rPr>
             </w:pPr>
             <w:r>
@@ -12014,18 +11948,6 @@
                 <w:lang w:val="en-US"/>
               </w:rPr>
               <w:t>EMA</w:t>
-            </w:r>
-            <w:r>
-              <w:rPr>
-                <w:lang w:val="en-US"/>
-              </w:rPr>
-              <w:t>I</w:t>
-            </w:r>
-            <w:r>
-              <w:rPr>
-                <w:lang w:val="en-US"/>
-              </w:rPr>
-              <w:t>LL</w:t>
             </w:r>
           </w:p>
           <w:p>
@@ -12160,7 +12082,7 @@
                 <w:rFonts w:ascii="Montserrat" w:eastAsia="Montserrat" w:hAnsi="Montserrat" w:cs="Montserrat"/>
                 <w:sz w:val="20"/>
                 <w:szCs w:val="20"/>
-                <w:lang w:val="ru-RU"/>
+                <w:lang w:val="en-US"/>
               </w:rPr>
             </w:pPr>
             <w:r>
@@ -12169,13 +12091,23 @@
                 <w:sz w:val="20"/>
                 <w:szCs w:val="20"/>
               </w:rPr>
-              <w:t>Заказчик:</w:t>
+              <w:t>Заказчик</w:t>
             </w:r>
             <w:r>
               <w:rPr>
                 <w:rFonts w:ascii="Montserrat" w:eastAsia="Montserrat" w:hAnsi="Montserrat" w:cs="Montserrat"/>
                 <w:sz w:val="20"/>
                 <w:szCs w:val="20"/>
+                <w:lang w:val="en-US"/>
+              </w:rPr>
+              <w:t>:</w:t>
+            </w:r>
+            <w:r>
+              <w:rPr>
+                <w:rFonts w:ascii="Montserrat" w:eastAsia="Montserrat" w:hAnsi="Montserrat" w:cs="Montserrat"/>
+                <w:sz w:val="20"/>
+                <w:szCs w:val="20"/>
+                <w:lang w:val="en-US"/>
               </w:rPr>
               <w:br/>
             </w:r>
@@ -12186,14 +12118,23 @@
                 <w:szCs w:val="20"/>
                 <w:lang w:val="ru-RU"/>
               </w:rPr>
-              <w:t>ФИО:</w:t>
+              <w:t>ФИО</w:t>
             </w:r>
             <w:r>
               <w:rPr>
                 <w:rFonts w:ascii="Montserrat" w:eastAsia="Montserrat" w:hAnsi="Montserrat" w:cs="Montserrat"/>
                 <w:sz w:val="20"/>
                 <w:szCs w:val="20"/>
-                <w:lang w:val="ru-RU"/>
+                <w:lang w:val="en-US"/>
+              </w:rPr>
+              <w:t>:</w:t>
+            </w:r>
+            <w:r>
+              <w:rPr>
+                <w:rFonts w:ascii="Montserrat" w:eastAsia="Montserrat" w:hAnsi="Montserrat" w:cs="Montserrat"/>
+                <w:sz w:val="20"/>
+                <w:szCs w:val="20"/>
+                <w:lang w:val="en-US"/>
               </w:rPr>
               <w:t xml:space="preserve"> </w:t>
             </w:r>
@@ -12224,14 +12165,23 @@
                 <w:szCs w:val="20"/>
                 <w:lang w:val="ru-RU"/>
               </w:rPr>
-              <w:t>Паспорт:</w:t>
+              <w:t>Паспорт</w:t>
             </w:r>
             <w:r>
               <w:rPr>
                 <w:rFonts w:ascii="Montserrat" w:eastAsia="Montserrat" w:hAnsi="Montserrat" w:cs="Montserrat"/>
                 <w:sz w:val="20"/>
                 <w:szCs w:val="20"/>
-                <w:lang w:val="ru-RU"/>
+                <w:lang w:val="en-US"/>
+              </w:rPr>
+              <w:t>:</w:t>
+            </w:r>
+            <w:r>
+              <w:rPr>
+                <w:rFonts w:ascii="Montserrat" w:eastAsia="Montserrat" w:hAnsi="Montserrat" w:cs="Montserrat"/>
+                <w:sz w:val="20"/>
+                <w:szCs w:val="20"/>
+                <w:lang w:val="en-US"/>
               </w:rPr>
               <w:t xml:space="preserve"> </w:t>
             </w:r>
@@ -12249,7 +12199,7 @@
                 <w:rFonts w:ascii="Montserrat" w:eastAsia="Montserrat" w:hAnsi="Montserrat" w:cs="Montserrat"/>
                 <w:sz w:val="20"/>
                 <w:szCs w:val="20"/>
-                <w:lang w:val="ru-RU"/>
+                <w:lang w:val="en-US"/>
               </w:rPr>
               <w:t xml:space="preserve"> </w:t>
             </w:r>
@@ -12267,7 +12217,7 @@
                 <w:rFonts w:ascii="Montserrat" w:eastAsia="Montserrat" w:hAnsi="Montserrat" w:cs="Montserrat"/>
                 <w:sz w:val="20"/>
                 <w:szCs w:val="20"/>
-                <w:lang w:val="ru-RU"/>
+                <w:lang w:val="en-US"/>
               </w:rPr>
               <w:t>,</w:t>
             </w:r>
@@ -12276,7 +12226,7 @@
                 <w:rFonts w:ascii="Montserrat" w:eastAsia="Montserrat" w:hAnsi="Montserrat" w:cs="Montserrat"/>
                 <w:sz w:val="20"/>
                 <w:szCs w:val="20"/>
-                <w:lang w:val="ru-RU"/>
+                <w:lang w:val="en-US"/>
               </w:rPr>
               <w:t xml:space="preserve"> </w:t>
             </w:r>
@@ -12437,7 +12387,7 @@
                 <w:color w:val="EE0000"/>
                 <w:sz w:val="20"/>
                 <w:szCs w:val="20"/>
-                <w:lang w:val="ru-RU"/>
+                <w:lang w:val="en-US"/>
               </w:rPr>
             </w:pPr>
             <w:r>
@@ -12454,7 +12404,7 @@
                 <w:rFonts w:ascii="Montserrat" w:eastAsia="Montserrat" w:hAnsi="Montserrat" w:cs="Montserrat"/>
                 <w:sz w:val="20"/>
                 <w:szCs w:val="20"/>
-                <w:lang w:val="ru-RU"/>
+                <w:lang w:val="en-US"/>
               </w:rPr>
               <w:t xml:space="preserve"> </w:t>
             </w:r>
@@ -12465,14 +12415,23 @@
                 <w:szCs w:val="20"/>
                 <w:lang w:val="ru-RU"/>
               </w:rPr>
-              <w:t>телефон:</w:t>
+              <w:t>телефон</w:t>
             </w:r>
             <w:r>
               <w:rPr>
                 <w:rFonts w:ascii="Montserrat" w:eastAsia="Montserrat" w:hAnsi="Montserrat" w:cs="Montserrat"/>
                 <w:sz w:val="20"/>
                 <w:szCs w:val="20"/>
-                <w:lang w:val="ru-RU"/>
+                <w:lang w:val="en-US"/>
+              </w:rPr>
+              <w:t>:</w:t>
+            </w:r>
+            <w:r>
+              <w:rPr>
+                <w:rFonts w:ascii="Montserrat" w:eastAsia="Montserrat" w:hAnsi="Montserrat" w:cs="Montserrat"/>
+                <w:sz w:val="20"/>
+                <w:szCs w:val="20"/>
+                <w:lang w:val="en-US"/>
               </w:rPr>
               <w:t xml:space="preserve"> </w:t>
             </w:r>

</xml_diff>